<commit_message>
Adjust all word doc Footers
</commit_message>
<xml_diff>
--- a/02 Habrit Khadasha/43 Yochanan/Yochanan 02.docx
+++ b/02 Habrit Khadasha/43 Yochanan/Yochanan 02.docx
@@ -120,7 +120,7 @@
           <w:szCs w:val="24"/>
           <w:rtl w:val="0"/>
         </w:rPr>
-        <w:t xml:space="preserve">On the third day, there was a wedding at Cana in the Galilee. Yeshua’s mother was there,</w:t>
+        <w:t xml:space="preserve">On the third day, there was a wedding at Cana in the Galil. The mother of Yeshua was there,</w:t>
       </w:r>
     </w:p>
     <w:p>
@@ -164,29 +164,29 @@
           <w:szCs w:val="24"/>
           <w:rtl w:val="0"/>
         </w:rPr>
-        <w:t xml:space="preserve">When the wine ran out, Yeshua’s mother said to Him, “They don’t have any wine!”</w:t>
-      </w:r>
-    </w:p>
-    <w:p>
-      <w:pPr>
-        <w:numPr>
-          <w:ilvl w:val="0"/>
-          <w:numId w:val="1"/>
-        </w:numPr>
-        <w:ind w:left="720" w:hanging="360"/>
-        <w:rPr>
-          <w:sz w:val="24"/>
-          <w:szCs w:val="24"/>
-          <w:u w:val="none"/>
-        </w:rPr>
-      </w:pPr>
-      <w:r>
-        <w:rPr>
-          <w:sz w:val="24"/>
-          <w:szCs w:val="24"/>
-          <w:rtl w:val="0"/>
-        </w:rPr>
-        <w:t xml:space="preserve">Yeshua said to her, “Woman, what does this have to do with you and Me? My hour hasn’t come yet.”</w:t>
+        <w:t xml:space="preserve">When the wine ran out, His mother said to Him, “They don’t have any wine!”</w:t>
+      </w:r>
+    </w:p>
+    <w:p>
+      <w:pPr>
+        <w:numPr>
+          <w:ilvl w:val="0"/>
+          <w:numId w:val="1"/>
+        </w:numPr>
+        <w:ind w:left="720" w:hanging="360"/>
+        <w:rPr>
+          <w:sz w:val="24"/>
+          <w:szCs w:val="24"/>
+          <w:u w:val="none"/>
+        </w:rPr>
+      </w:pPr>
+      <w:r>
+        <w:rPr>
+          <w:sz w:val="24"/>
+          <w:szCs w:val="24"/>
+          <w:rtl w:val="0"/>
+        </w:rPr>
+        <w:t xml:space="preserve">Yeshua said to her, “Woman, what does this have to do with you and Me? My hour has not yet come.”</w:t>
       </w:r>
     </w:p>
     <w:p>
@@ -520,6 +520,23 @@
       <w:pPr>
         <w:ind w:left="720" w:firstLine="0"/>
         <w:rPr>
+          <w:sz w:val="24"/>
+          <w:szCs w:val="24"/>
+        </w:rPr>
+      </w:pPr>
+      <w:r>
+        <w:rPr>
+          <w:rtl w:val="0"/>
+        </w:rPr>
+      </w:r>
+    </w:p>
+    <w:p>
+      <w:pPr>
+        <w:jc w:val="center"/>
+        <w:rPr>
+          <w:b w:val="1"/>
+          <w:bCs w:val="1"/>
+          <w:color w:val="999999"/>
           <w:sz w:val="24"/>
           <w:szCs w:val="24"/>
         </w:rPr>

</xml_diff>